<commit_message>
Actualizamos el documento de requisitos con React
</commit_message>
<xml_diff>
--- a/docs/Anexo 4 - ERS Grano.docx
+++ b/docs/Anexo 4 - ERS Grano.docx
@@ -180,7 +180,7 @@
           <w:rFonts w:ascii="Calibri" w:hAnsi="Calibri"/>
           <w:color w:val="000000"/>
         </w:rPr>
-        <w:t>Evaluación parcial 1</w:t>
+        <w:t>Proyecto Grano en evolución</w:t>
       </w:r>
     </w:p>
     <w:p>
@@ -194,7 +194,7 @@
           <w:color w:val="58645C"/>
           <w:sz w:val="20"/>
         </w:rPr>
-        <w:t>Septiembre de 2026</w:t>
+        <w:t>Octubre de 2026</w:t>
       </w:r>
     </w:p>
     <w:p>
@@ -3404,11 +3404,9 @@
             <w:vAlign w:val="center"/>
           </w:tcPr>
           <w:p>
-            <w:pPr>
-              <w:rPr>
-                <w:iCs/>
-              </w:rPr>
-            </w:pPr>
+            <w:r>
+              <w:t>26/10/2026</w:t>
+            </w:r>
           </w:p>
         </w:tc>
         <w:tc>
@@ -3416,14 +3414,22 @@
             <w:tcW w:w="1080" w:type="dxa"/>
             <w:vAlign w:val="center"/>
           </w:tcPr>
-          <w:p/>
+          <w:p>
+            <w:r>
+              <w:t>1.3</w:t>
+            </w:r>
+          </w:p>
         </w:tc>
         <w:tc>
           <w:tcPr>
             <w:tcW w:w="3060" w:type="dxa"/>
             <w:vAlign w:val="center"/>
           </w:tcPr>
-          <w:p/>
+          <w:p>
+            <w:r>
+              <w:t>Brian Bravo y Matías Guerra</w:t>
+            </w:r>
+          </w:p>
         </w:tc>
         <w:tc>
           <w:tcPr>
@@ -3431,11 +3437,9 @@
             <w:vAlign w:val="center"/>
           </w:tcPr>
           <w:p>
-            <w:pPr>
-              <w:rPr>
-                <w:iCs/>
-              </w:rPr>
-            </w:pPr>
+            <w:r>
+              <w:t>Incorporación de React y actualización de catálogo, imágenes, carrito, registro y página Nosotros.</w:t>
+            </w:r>
           </w:p>
         </w:tc>
       </w:tr>
@@ -3606,9 +3610,8 @@
           <w:szCs w:val="24"/>
         </w:rPr>
       </w:pPr>
-      <w:r/>
-      <w:r>
-        <w:t>Versión funcional para revisión. Incluye catálogo, cuentas, pedidos, administración y contacto persistido localmente.</w:t>
+      <w:r>
+        <w:t>Versión actualizada. El sitio original y la aplicación React presentan la tienda; React permite registrar cuentas, administrar productos y guardar pedidos de prueba en el navegador.</w:t>
       </w:r>
     </w:p>
     <w:p>
@@ -3935,7 +3938,7 @@
         <w:spacing w:after="100"/>
       </w:pPr>
       <w:r>
-        <w:t>Grano es una tienda de café de especialidad pensada para quienes disfrutan preparar una buena taza en casa. Esta especificación ordena la idea, el alcance y las características principales del sitio.</w:t>
+        <w:t>Grano es una tienda de café de especialidad para personas que disfrutan preparar una buena taza en casa. Este documento describe qué ofrece la tienda, cómo se recorre y qué funciones tiene la versión que estamos desarrollando.</w:t>
       </w:r>
     </w:p>
     <w:p>
@@ -3972,7 +3975,7 @@
           <w:rFonts w:ascii="Aptos" w:hAnsi="Aptos"/>
           <w:color w:val="000000"/>
         </w:rPr>
-        <w:t>El propósito de este documento es dejar claro qué problema resuelve Grano y qué experiencia queremos ofrecer. La tienda debe ayudar a las personas a encontrar un café, método o accesorio que se ajuste a su forma de preparar una taza. La ERS reúne las decisiones principales de la propuesta para que el diseño y las próximas mejoras sigan una misma dirección.</w:t>
+        <w:t>Queremos que cualquier persona pueda conocer Grano, comparar sus productos y encontrar una forma de preparar café que le acomode. Esta especificación reúne las funciones y condiciones que guían el proyecto, y nos permite revisar si la experiencia funciona como esperamos.</w:t>
       </w:r>
     </w:p>
     <w:p>
@@ -4005,7 +4008,7 @@
         <w:spacing w:after="100"/>
       </w:pPr>
       <w:r>
-        <w:t>El sistema se llama Grano. La propuesta reúne café en grano, métodos de preparación y accesorios para quienes disfrutan preparar una taza en casa. La primera versión se enfoca en presentar la tienda y permitir un recorrido simple por sus secciones.</w:t>
+        <w:t>Grano reúne café en grano, métodos de preparación y accesorios en una tienda de navegación sencilla. El visitante puede conocer la propuesta, explorar productos y enviar una consulta; quien crea una cuenta de comprador también puede armar un carrito y registrar un pedido de prueba.</w:t>
       </w:r>
     </w:p>
     <w:p>
@@ -4013,9 +4016,8 @@
         <w:keepLines/>
         <w:spacing w:after="100"/>
       </w:pPr>
-      <w:r/>
-      <w:r>
-        <w:t>El alcance considera Inicio, catálogo, fichas de productos, sección Nosotros con carrusel, Contacto, carrito, registro e inicio de sesión, cuenta del comprador y panel de administración. La implementación actual funciona como una demostración estática y guarda cuentas, pedidos y mensajes en localStorage.</w:t>
+      <w:r>
+        <w:t>El alcance incluye Inicio, Nuestro café, Nosotros, Contacto, fichas de productos, carrito, cuenta de comprador y administración. La versión actual funciona en el navegador y guarda los datos de la demostración de manera local. Permite registrar pedidos de prueba, pero no procesa pagos ni utiliza un servidor.</w:t>
       </w:r>
     </w:p>
     <w:p>
@@ -4048,7 +4050,7 @@
         <w:spacing w:after="100"/>
       </w:pPr>
       <w:r>
-        <w:t>ERS significa Especificación de Requisitos de Software. RF identifica un requisito funcional y RNF uno no funcional. Un producto corresponde a un café, método o accesorio disponible en la tienda. CLP corresponde a pesos chilenos.</w:t>
+        <w:t>ERS significa Especificación de Requisitos de Software. RF identifica un requisito funcional y RNF uno no funcional. CLP corresponde a pesos chilenos. localStorage es el almacenamiento del navegador que usamos para conservar los datos de esta demostración.</w:t>
       </w:r>
     </w:p>
     <w:p>
@@ -4057,7 +4059,7 @@
         <w:spacing w:after="100"/>
       </w:pPr>
       <w:r>
-        <w:t>Una tienda de especialidad reúne productos seleccionados y los presenta con información de origen, preparación y precio. En este documento, visitante y administrador describen los perfiles que se considerarán para el crecimiento del sistema.</w:t>
+        <w:t>Llamamos visitante a quien recorre la tienda sin iniciar sesión; comprador a quien crea una cuenta para registrar pedidos; y administrador a quien mantiene productos y revisa la información recibida.</w:t>
       </w:r>
     </w:p>
     <w:p>
@@ -4090,7 +4092,7 @@
         <w:spacing w:after="100"/>
       </w:pPr>
       <w:r>
-        <w:t>La propuesta se inspira en el funcionamiento habitual de una tienda de café de especialidad: catálogo organizado, información clara de cada producto y un canal de contacto para orientar al visitante.</w:t>
+        <w:t>La idea de Grano toma como referencia la experiencia habitual de una tienda de café de especialidad: productos presentados con imágenes, precios claros, información para elegir y una forma sencilla de comunicarse con la tienda.</w:t>
       </w:r>
     </w:p>
     <w:p>
@@ -4099,7 +4101,7 @@
         <w:spacing w:after="100"/>
       </w:pPr>
       <w:r>
-        <w:t>Las funciones de compra, autenticación y gestión de información se consideran parte de una etapa posterior. Esta primera propuesta prioriza la organización del contenido y la navegación para validar la idea de la tienda.</w:t>
+        <w:t>También consideramos el recorrido de una persona que prepara café en casa: primero conoce la tienda, después revisa un producto y finalmente decide si quiere guardarlo en su carrito.</w:t>
       </w:r>
     </w:p>
     <w:p>
@@ -4108,7 +4110,7 @@
         <w:spacing w:after="100"/>
       </w:pPr>
       <w:r>
-        <w:t>La propuesta toma como referencia la presentación de tiendas de café, la información habitual de productos y las necesidades de una persona que busca preparar café en casa.</w:t>
+        <w:t>Estas referencias orientan el contenido y la organización del sitio. Las decisiones técnicas y las funciones implementadas se describen en las secciones siguientes.</w:t>
       </w:r>
     </w:p>
     <w:p>
@@ -4175,7 +4177,7 @@
         <w:spacing w:after="100"/>
       </w:pPr>
       <w:r>
-        <w:t>Grano presenta una colección de cafés, métodos y accesorios con una identidad cálida y sencilla. La navegación principal se organiza en Inicio, Nuestro café, Nosotros y Contacto, para que el visitante encuentre rápidamente la información que busca.</w:t>
+        <w:t>Grano presenta una colección de cafés, métodos y accesorios con una identidad cálida y sencilla. La navegación principal se organiza en Inicio, Nuestro café, Nosotros y Contacto; el carrito y las opciones de cuenta aparecen en el mismo encabezado.</w:t>
       </w:r>
     </w:p>
     <w:p>
@@ -4208,7 +4210,7 @@
         <w:spacing w:after="100"/>
       </w:pPr>
       <w:r>
-        <w:t>Grano funciona como una tienda independiente. La información de productos, sus imágenes y el contenido de cada sección deben mantenerse disponibles para el visitante.</w:t>
+        <w:t>El sitio HTML original y la aplicación React muestran la misma propuesta de tienda. React reúne las pantallas y los datos de la demostración en una aplicación independiente, mientras el sitio inicial sigue disponible como referencia del diseño.</w:t>
       </w:r>
     </w:p>
     <w:p>
@@ -4240,9 +4242,8 @@
         <w:keepLines/>
         <w:spacing w:after="100"/>
       </w:pPr>
-      <w:r/>
-      <w:r>
-        <w:t>La tienda permite conocer la propuesta, revisar el catálogo, consultar fichas, agregar productos al carrito, confirmar pedidos, crear cuentas de comprador, iniciar sesión, actualizar datos personales, cambiar contraseñas y enviar mensajes desde Contacto. El administrador puede revisar pedidos, usuarios y mensajes y crear cuentas con distintos roles.</w:t>
+      <w:r>
+        <w:t>En React se puede recorrer la tienda, abrir fichas, agregar y quitar productos del carrito, ver imágenes y total, crear una cuenta e iniciar sesión, registrar un pedido de prueba, consultar el historial, actualizar el perfil y enviar mensajes. El administrador puede revisar pedidos, usuarios y mensajes, crear cuentas con roles y agregar o quitar productos nuevos con una imagen opcional.</w:t>
       </w:r>
     </w:p>
     <w:p>
@@ -4250,14 +4251,11 @@
         <w:keepLines/>
         <w:spacing w:after="100"/>
       </w:pPr>
-      <w:r/>
+      <w:r>
+        <w:t>El recorrido comienza en Inicio. Nuestro café muestra los productos y permite entrar a cada ficha; Nosotros explica la propuesta de Grano con texto e ilustración, y Contacto reúne las consultas. Desde Inicio hay un acceso al catálogo y otro para conocer la historia de la tienda.</w:t>
+      </w:r>
       <w:proofErr w:type="gramStart"/>
-      <w:r/>
       <w:proofErr w:type="gramEnd"/>
-      <w:r/>
-      <w:r>
-        <w:t>El recorrido principal comienza en Inicio, continúa en Nuestro café y permite abrir el detalle de cada producto. Nosotros explica la propuesta mediante un carrusel de imágenes y Contacto permite enviar consultas que quedan disponibles para el administrador.</w:t>
-      </w:r>
     </w:p>
     <w:p>
       <w:pPr>
@@ -4288,9 +4286,8 @@
         <w:keepLines/>
         <w:spacing w:after="100"/>
       </w:pPr>
-      <w:r/>
-      <w:r>
-        <w:t>El visitante necesita conocimientos básicos de navegación para recorrer el catálogo y enviar una consulta. El comprador puede registrarse, iniciar sesión, confirmar pedidos y actualizar sus datos. El administrador revisa pedidos, usuarios y mensajes.</w:t>
+      <w:r>
+        <w:t>El visitante puede revisar los productos y enviar una consulta. El comprador registra su cuenta con un RUT válido, entra automáticamente al terminar el registro y puede confirmar pedidos de prueba. El administrador mantiene el catálogo y consulta pedidos, usuarios y mensajes.</w:t>
       </w:r>
     </w:p>
     <w:p>
@@ -4299,7 +4296,7 @@
         <w:spacing w:after="100"/>
       </w:pPr>
       <w:r>
-        <w:t>El cliente podrá consultar productos y realizar compras cuando se habiliten esas funciones. El administrador podrá mantener el catálogo y revisar las solicitudes recibidas. Cada perfil tendrá permisos definidos cuando se implemente la lógica del sistema.</w:t>
+        <w:t>Cada persona ve las opciones que corresponden a su rol. El pedido solo se puede confirmar desde una cuenta de comprador; si alguien no ha iniciado sesión, el carrito le ofrece ir a la pantalla de acceso.</w:t>
       </w:r>
     </w:p>
     <w:p>
@@ -4332,7 +4329,7 @@
         <w:spacing w:after="100"/>
       </w:pPr>
       <w:r>
-        <w:t>La propuesta debe conservar una estructura clara, una navegación sencilla y una presentación que funcione en pantallas de escritorio y teléfonos. El contenido de los productos debe mantenerse ordenado para facilitar futuras actualizaciones.</w:t>
+        <w:t>La interfaz debe conservar una navegación clara y adaptarse a escritorio y celular. Las imágenes de los productos deben verse en el catálogo, la ficha y el carrito. Para agregar una imagen desde administración aceptamos JPG, PNG o WebP de hasta 500 KB, porque se guarda en el navegador.</w:t>
       </w:r>
     </w:p>
     <w:p>
@@ -4340,9 +4337,8 @@
         <w:keepLines/>
         <w:spacing w:after="100"/>
       </w:pPr>
-      <w:r/>
-      <w:r>
-        <w:t>Las funciones de compra, inicio de sesión y gestión de datos están implementadas como demostración local mediante localStorage. No existe backend, pasarela de pago ni almacenamiento seguro para producción.</w:t>
+      <w:r>
+        <w:t>Esta versión es una demostración local: cuentas, contraseñas, productos agregados, mensajes, carrito y pedidos se guardan en localStorage. No hay backend, pago real, despacho ni protección de datos adecuada para publicar una tienda comercial.</w:t>
       </w:r>
     </w:p>
     <w:p>
@@ -4375,7 +4371,7 @@
         <w:spacing w:after="100"/>
       </w:pPr>
       <w:r>
-        <w:t>Se supone que el visitante utilizará un navegador actualizado y que la información de productos será revisada antes de publicarse. También se considera que la tienda crecerá por etapas y que sus requisitos podrán ajustarse según las necesidades del negocio.</w:t>
+        <w:t>Suponemos que la persona usará un navegador actualizado y que la información de cada producto se revisará antes de publicarse. Para ejecutar React durante el desarrollo se necesita iniciar el servidor de Vite desde la carpeta react.</w:t>
       </w:r>
     </w:p>
     <w:p>
@@ -4384,7 +4380,7 @@
         <w:spacing w:after="100"/>
       </w:pPr>
       <w:r>
-        <w:t>El alcance podrá ampliarse con compras, cuentas, pagos, gestión de stock y seguimiento de solicitudes cuando la propuesta de negocio lo requiera.</w:t>
+        <w:t>Los datos de prueba quedan en el navegador donde se crearon y no se comparten entre equipos. Una futura versión con servidor deberá definir cómo conservar usuarios, productos y pedidos de forma centralizada.</w:t>
       </w:r>
     </w:p>
     <w:p>
@@ -4417,9 +4413,8 @@
         <w:keepLines/>
         <w:spacing w:after="100"/>
       </w:pPr>
-      <w:r/>
-      <w:r>
-        <w:t>Como siguientes etapas se pueden incorporar un backend, autenticación segura, pagos, stock, despacho, respuestas a mensajes y gestión completa del catálogo. Estas mejoras dependerán de las prioridades definidas para la tienda.</w:t>
+      <w:r>
+        <w:t>Más adelante se pueden incorporar un backend, autenticación segura, pagos, stock, despacho, respuestas a mensajes y edición completa del catálogo. Esas funciones requieren reglas de negocio y persistencia distintas de la demostración actual.</w:t>
       </w:r>
     </w:p>
     <w:p>
@@ -4452,7 +4447,7 @@
         <w:spacing w:after="100"/>
       </w:pPr>
       <w:r>
-        <w:t>Los requisitos de esta versión describen comportamientos visibles y condiciones que podemos revisar en la tienda. Usamos códigos RF y RNF para mantener una referencia ordenada entre los requisitos y las secciones del sistema.</w:t>
+        <w:t>Los requisitos siguientes describen lo que se puede revisar hoy en la aplicación React y las condiciones de presentación que queremos conservar. Mantenemos los códigos RF y RNF para relacionar cada requisito con su comprobación.</w:t>
       </w:r>
     </w:p>
     <w:p>
@@ -4490,9 +4485,8 @@
         <w:keepLines/>
         <w:spacing w:after="100"/>
       </w:pPr>
-      <w:r/>
-      <w:r>
-        <w:t>Las entradas incluyen navegación, formularios de autenticación, perfil, contacto y carrito. Las salidas son páginas, imágenes, tablas de pedidos, usuarios y mensajes. En esta demostración las acciones modifican localStorage del navegador.</w:t>
+      <w:r>
+        <w:t>Las entradas son el menú, los formularios, las fichas y el carrito. Las salidas son las pantallas de la tienda, las imágenes, los mensajes y los listados de cuenta y administración. Los cambios de datos de esta demostración se conservan en localStorage.</w:t>
       </w:r>
     </w:p>
     <w:p>
@@ -4525,7 +4519,7 @@
         <w:spacing w:after="100"/>
       </w:pPr>
       <w:r>
-        <w:t>Todas las páginas comparten la marca Grano, el menú superior y el pie. Los productos se muestran en tarjetas. En administración usamos un menú lateral que pasa arriba del contenido en pantallas pequeñas. El diseño conserva verde oscuro, crema y tipografía legible.</w:t>
+        <w:t>Las pantallas React comparten la marca, el menú superior y el pie. El catálogo utiliza tarjetas con imagen, nombre, categoría y precio. Los formularios tienen etiquetas y la paleta mantiene los tonos verde y crema de Grano.</w:t>
       </w:r>
     </w:p>
     <w:p>
@@ -4575,11 +4569,6 @@
           <w:rFonts w:asciiTheme="minorHAnsi" w:hAnsiTheme="minorHAnsi" w:cstheme="minorHAnsi"/>
         </w:rPr>
         <w:t>3.1.3</w:t>
-      </w:r>
-      <w:r>
-        <w:rPr>
-          <w:rFonts w:asciiTheme="minorHAnsi" w:hAnsiTheme="minorHAnsi" w:cstheme="minorHAnsi"/>
-        </w:rPr>
         <w:tab/>
         <w:t>Interfaces de software</w:t>
       </w:r>
@@ -4591,7 +4580,7 @@
         <w:spacing w:after="100"/>
       </w:pPr>
       <w:r>
-        <w:t>La interfaz se organiza con páginas web y estilos propios. La solución debe ser fácil de mantener y trasladar a otro equipo de trabajo.</w:t>
+        <w:t>El sitio inicial se compone de páginas HTML con CSS y Bootstrap. La aplicación nueva usa React y Vite, con componentes y archivos de estilo propios. Ambas versiones se pueden revisar por separado.</w:t>
       </w:r>
     </w:p>
     <w:p>
@@ -4624,7 +4613,7 @@
         <w:spacing w:after="100"/>
       </w:pPr>
       <w:r>
-        <w:t>Las páginas y los recursos se enlazan de forma interna. Las futuras integraciones deberán definirse según las necesidades de la tienda.</w:t>
+        <w:t>La aplicación React se abre desde el servidor local de Vite durante el desarrollo. No envía los formularios a un servicio externo; las futuras conexiones deberán definirse cuando exista un backend.</w:t>
       </w:r>
     </w:p>
     <w:p>
@@ -4659,7 +4648,7 @@
         <w:spacing w:after="100"/>
       </w:pPr>
       <w:r>
-        <w:t>Los siguientes requisitos describen las funciones que debe entregar la tienda y las condiciones que debe cumplir para ser clara, consistente y fácil de mantener.</w:t>
+        <w:t>Los diez requisitos funcionales siguientes describen acciones que una persona puede realizar en la tienda y la forma en que comprobamos cada una.</w:t>
       </w:r>
     </w:p>
     <w:p>
@@ -4682,7 +4671,7 @@
         <w:spacing w:after="100"/>
       </w:pPr>
       <w:r>
-        <w:t>La tienda debe permitir recorrer sus páginas mediante el menú, el logo y los enlaces del pie. Actor: Visitante.</w:t>
+        <w:t>La tienda debe permitir ir a Inicio, Nuestro café, Nosotros y Contacto desde el menú, y volver a Inicio desde la marca. Actor: Visitante.</w:t>
       </w:r>
     </w:p>
     <w:p>
@@ -4691,7 +4680,7 @@
         <w:spacing w:after="100"/>
       </w:pPr>
       <w:r>
-        <w:t>Lo revisamos así: Desde cada página se puede volver a Inicio y abrir Nuestro café, Nosotros y Contacto.</w:t>
+        <w:t>Lo revisamos así: cada opción abre su pantalla correspondiente sin perder la navegación principal.</w:t>
       </w:r>
     </w:p>
     <w:p>
@@ -4714,7 +4703,7 @@
         <w:spacing w:after="100"/>
       </w:pPr>
       <w:r>
-        <w:t>El inicio debe mostrar la identidad de Grano, una imagen principal y tres productos destacados. Actor: Visitante.</w:t>
+        <w:t>Inicio debe presentar la identidad de Grano, una imagen principal y accesos claros al catálogo y a la historia de la tienda. Actor: Visitante.</w:t>
       </w:r>
     </w:p>
     <w:p>
@@ -4723,7 +4712,7 @@
         <w:spacing w:after="100"/>
       </w:pPr>
       <w:r>
-        <w:t>Lo revisamos así: Se ve el nombre Grano, una presentación, una ilustración y tres tarjetas con nombre, imagen y precio.</w:t>
+        <w:t>Lo revisamos así: se ve la presentación de Grano y los botones llevan a Nuestro café y Nosotros.</w:t>
       </w:r>
     </w:p>
     <w:p>
@@ -4746,7 +4735,7 @@
         <w:spacing w:after="100"/>
       </w:pPr>
       <w:r>
-        <w:t>El catálogo debe mostrar seis productos de ejemplo con imagen, nombre, precio en CLP y acceso al detalle. Actor: Visitante.</w:t>
+        <w:t>Nuestro café debe mostrar los seis productos iniciales y los que agregue el administrador, con imagen, nombre, categoría, precio en CLP y acceso al detalle. Actor: Visitante.</w:t>
       </w:r>
     </w:p>
     <w:p>
@@ -4755,7 +4744,7 @@
         <w:spacing w:after="100"/>
       </w:pPr>
       <w:r>
-        <w:t>Lo revisamos así: Los seis productos se ven y cada enlace abre su ficha correspondiente; Añadir permanece deshabilitado.</w:t>
+        <w:t>Lo revisamos así: las tarjetas aparecen en el catálogo y un producto nuevo se ve sin recargar la página.</w:t>
       </w:r>
     </w:p>
     <w:p>
@@ -4778,7 +4767,7 @@
         <w:spacing w:after="100"/>
       </w:pPr>
       <w:r>
-        <w:t>Cada producto debe tener una ficha estática con descripción, imagen y precio. Actor: Visitante.</w:t>
+        <w:t>Cada producto debe mostrar su imagen, descripción, detalle y precio, además de permitir volver al catálogo o agregarlo al carrito. Actor: Visitante.</w:t>
       </w:r>
     </w:p>
     <w:p>
@@ -4787,7 +4776,7 @@
         <w:spacing w:after="100"/>
       </w:pPr>
       <w:r>
-        <w:t>Lo revisamos así: Hay seis fichas diferentes y todas permiten volver al catálogo sin agregar productos a la bolsa.</w:t>
+        <w:t>Lo revisamos así: al abrir una tarjeta aparece su ficha y el botón de agregar actualiza el carrito.</w:t>
       </w:r>
     </w:p>
     <w:p>
@@ -4811,9 +4800,8 @@
         <w:keepLines/>
         <w:spacing w:after="100"/>
       </w:pPr>
-      <w:r/>
-      <w:r>
-        <w:t>El carrito debe permitir agregar, revisar y quitar productos, calcular el total y confirmar un pedido para un comprador autenticado. Actor: Comprador.</w:t>
+      <w:r>
+        <w:t>El carrito debe mostrar los productos con su imagen y precio, permitir quitarlos, calcular el total y registrar un pedido de prueba cuando el comprador haya iniciado sesión. Actor: Comprador.</w:t>
       </w:r>
     </w:p>
     <w:p>
@@ -4821,9 +4809,8 @@
         <w:keepLines/>
         <w:spacing w:after="100"/>
       </w:pPr>
-      <w:r/>
-      <w:r>
-        <w:t>Lo revisamos así: El carrito actualiza cantidades y total, solicita iniciar sesión si corresponde y registra el pedido con estado Recibido.</w:t>
+      <w:r>
+        <w:t>Lo revisamos así: el pedido aparece en Mi cuenta, el carrito queda vacío y también se vacía al cerrar sesión. Si no hay sesión, se ofrece ir al acceso.</w:t>
       </w:r>
     </w:p>
     <w:p>
@@ -4847,9 +4834,8 @@
         <w:keepLines/>
         <w:spacing w:after="100"/>
       </w:pPr>
-      <w:r/>
-      <w:r>
-        <w:t>El sitio debe permitir registrar compradores, iniciar sesión como comprador o administrador, cerrar sesión y cambiar la contraseña. Actor: Comprador y Administrador.</w:t>
+      <w:r>
+        <w:t>El sitio debe permitir registrar compradores con RUT válido y dígito verificador correcto, iniciar y cerrar sesión, y cambiar la contraseña. Al completar el registro, la sesión debe abrirse automáticamente. Actor: Comprador y Administrador.</w:t>
       </w:r>
     </w:p>
     <w:p>
@@ -4857,9 +4843,8 @@
         <w:keepLines/>
         <w:spacing w:after="100"/>
       </w:pPr>
-      <w:r/>
-      <w:r>
-        <w:t>Lo revisamos así: Un comprador puede crear su cuenta e iniciar sesión; el administrador inicial es admin@duocuc.cl con contraseña 1234; ambos pueden cerrar sesión.</w:t>
+      <w:r>
+        <w:t>Lo revisamos así: una cuenta nueva lleva a Mi cuenta sin repetir el inicio de sesión; los datos incorrectos impiden el acceso y la opción Salir cierra la sesión.</w:t>
       </w:r>
     </w:p>
     <w:p>
@@ -4872,9 +4857,7 @@
         <w:rPr>
           <w:b/>
         </w:rPr>
-      </w:r>
-      <w:r>
-        <w:t>RF-07 Conocer el proyecto y enviar mensajes</w:t>
+        <w:t>RF-07 Conocer Grano y enviar mensajes</w:t>
       </w:r>
     </w:p>
     <w:p>
@@ -4884,26 +4867,21 @@
         <w:spacing w:after="100"/>
       </w:pPr>
       <w:proofErr w:type="gramStart"/>
-      <w:r/>
+      <w:r>
+        <w:t>Nosotros debe explicar la propuesta de Grano con texto e imagen. Contacto debe permitir enviar un mensaje para que el administrador lo revise. Actor: Visitante y Administrador.</w:t>
+      </w:r>
       <w:proofErr w:type="gramEnd"/>
-      <w:r/>
-      <w:r>
-        <w:t>Nosotros debe presentar Grano mediante un carrusel; Contacto debe permitir enviar un mensaje. El administrador debe poder consultar los mensajes recibidos. Actor: Visitante y Administrador.</w:t>
-      </w:r>
     </w:p>
     <w:p>
       <w:pPr>
         <w:keepLines/>
         <w:spacing w:after="100"/>
       </w:pPr>
-      <w:r/>
+      <w:r>
+        <w:t>Lo revisamos así: Nosotros se abre desde el menú y desde Inicio; el mensaje enviado aparece en administración.</w:t>
+      </w:r>
       <w:proofErr w:type="gramStart"/>
-      <w:r/>
       <w:proofErr w:type="gramEnd"/>
-      <w:r/>
-      <w:r>
-        <w:t>Lo revisamos así: Nosotros muestra imágenes navegables y Contacto registra el mensaje con fecha y estado para verlo en administración.</w:t>
-      </w:r>
     </w:p>
     <w:p>
       <w:pPr>
@@ -4934,7 +4912,7 @@
         <w:spacing w:after="100"/>
       </w:pPr>
       <w:r>
-        <w:t>Lo revisamos así: Los seis productos muestran una categoría y utilizan etiquetas fáciles de reconocer.</w:t>
+        <w:t>Lo revisamos así: cada tarjeta muestra si corresponde a café en grano, método o accesorio.</w:t>
       </w:r>
     </w:p>
     <w:p>
@@ -4958,9 +4936,8 @@
         <w:keepLines/>
         <w:spacing w:after="100"/>
       </w:pPr>
-      <w:r/>
-      <w:r>
-        <w:t>El panel debe mostrar pedidos de clientes, productos comprados, usuarios registrados y mensajes enviados por clientes. Actor: Administrador.</w:t>
+      <w:r>
+        <w:t>El panel debe permitir revisar pedidos, usuarios y mensajes, además de crear cuentas con rol comprador o administrador. Actor: Administrador.</w:t>
       </w:r>
     </w:p>
     <w:p>
@@ -4968,9 +4945,8 @@
         <w:keepLines/>
         <w:spacing w:after="100"/>
       </w:pPr>
-      <w:r/>
-      <w:r>
-        <w:t>Lo revisamos así: El administrador inicia sesión y ve las tablas de pedidos, usuarios y mensajes; también puede crear compradores y administradores.</w:t>
+      <w:r>
+        <w:t>Lo revisamos así: al entrar como administrador aparecen los listados y una cuenta nueva se incorpora al listado sin recargar.</w:t>
       </w:r>
     </w:p>
     <w:p>
@@ -4983,9 +4959,7 @@
         <w:rPr>
           <w:b/>
         </w:rPr>
-      </w:r>
-      <w:r>
-        <w:t>RF-10 Crear usuarios con roles</w:t>
+        <w:t>RF-10 Mantener los productos del catálogo</w:t>
       </w:r>
     </w:p>
     <w:p>
@@ -4994,9 +4968,8 @@
         <w:keepLines/>
         <w:spacing w:after="100"/>
       </w:pPr>
-      <w:r/>
-      <w:r>
-        <w:t>El administrador debe poder crear nuevos usuarios y definir si cada cuenta corresponde a un comprador o administrador. Actor: Administrador.</w:t>
+      <w:r>
+        <w:t>El administrador debe poder agregar un producto con nombre, categoría, descripción, detalle, precio e imagen opcional, y quitar los productos creados en esta versión. Actor: Administrador.</w:t>
       </w:r>
     </w:p>
     <w:p>
@@ -5004,9 +4977,8 @@
         <w:keepLines/>
         <w:spacing w:after="100"/>
       </w:pPr>
-      <w:r/>
-      <w:r>
-        <w:t>Lo revisamos así: El formulario administrativo crea usuarios con rol comprador o administrador y actualiza el listado sin recargar la página.</w:t>
+      <w:r>
+        <w:t>Lo revisamos así: se puede elegir una imagen JPG, PNG o WebP de hasta 500 KB; el producto aparece en el catálogo y conserva su imagen al recargar.</w:t>
       </w:r>
     </w:p>
     <w:p>
@@ -5065,7 +5037,7 @@
         <w:spacing w:after="100"/>
       </w:pPr>
       <w:r>
-        <w:t>RNF-06 Mantener disponibles los recursos visuales. Cada producto debe conservar su imagen y la información necesaria para comprenderlo.</w:t>
+        <w:t>RNF-06 Mantener disponibles los recursos visuales. Cada producto debe conservar su imagen en el catálogo, el detalle y el carrito para que se reconozca con facilidad.</w:t>
       </w:r>
     </w:p>
     <w:p>
@@ -5074,16 +5046,10 @@
         <w:spacing w:after="100"/>
       </w:pPr>
       <w:r>
-        <w:t xml:space="preserve">En esta etapa no fijamos tiempos de respuesta de un servidor ni cantidades de transacciones por segundo, porque no hay </w:t>
+        <w:t>No fijamos tiempos de respuesta del servidor porque todavía no existe uno. En esta demostración revisamos que la navegación y las actualizaciones locales respondan sin recargar toda la página.</w:t>
       </w:r>
       <w:proofErr w:type="spellStart"/>
-      <w:r>
-        <w:t>backend</w:t>
-      </w:r>
       <w:proofErr w:type="spellEnd"/>
-      <w:r>
-        <w:t xml:space="preserve"> ni compras que procesar.</w:t>
-      </w:r>
     </w:p>
     <w:p>
       <w:pPr>
@@ -5114,9 +5080,8 @@
         <w:keepLines/>
         <w:spacing w:after="100"/>
       </w:pPr>
-      <w:r/>
-      <w:r>
-        <w:t>RNF-07 Tratar los datos personales con cuidado. La información de cuenta, perfil, pedidos y contacto debe conservarse dentro del alcance de la demostración.</w:t>
+      <w:r>
+        <w:t>RNF-07 Limitar el uso de datos de prueba. Las cuentas, los mensajes y los pedidos de esta versión deben permanecer en el navegador y no tratarse como información protegida para producción.</w:t>
       </w:r>
     </w:p>
     <w:p>
@@ -5124,9 +5089,8 @@
         <w:keepLines/>
         <w:spacing w:after="100"/>
       </w:pPr>
-      <w:r/>
-      <w:r>
-        <w:t>La demostración guarda datos en localStorage y restringe visualmente el panel según el rol. Para producción se requiere backend, hash de contraseñas, sesiones seguras y controles de autorización.</w:t>
+      <w:r>
+        <w:t>La demostración conserva contraseñas y otros datos en localStorage y muestra pantallas según el rol. Antes de publicar una tienda real se necesitarán autenticación y autorización en un servidor, sesiones seguras y protección de contraseñas.</w:t>
       </w:r>
     </w:p>
     <w:p>
@@ -5159,7 +5123,7 @@
         <w:spacing w:after="100"/>
       </w:pPr>
       <w:r>
-        <w:t>RNF-09 Mantener enlaces y recursos válidos. Cada destino interno debe existir. Revisamos las 26 páginas para detectar enlaces inexistentes, imágenes rotas y anclas sin destino.</w:t>
+        <w:t>RNF-09 Mantener destinos y recursos válidos. Los botones del menú, las fichas y las imágenes deben abrir o mostrarse correctamente en la aplicación React.</w:t>
       </w:r>
     </w:p>
     <w:p>
@@ -5192,7 +5156,7 @@
         <w:spacing w:after="100"/>
       </w:pPr>
       <w:r>
-        <w:t>RNF-05 Facilitar el acceso a la tienda. Las páginas principales deben abrirse desde un navegador y sus enlaces deben llevar a la sección correspondiente.</w:t>
+        <w:t>RNF-05 Facilitar el acceso a la tienda. Las pantallas principales deben abrirse desde un navegador actualizado y el menú debe permitir recorrerlas sin pasos innecesarios.</w:t>
       </w:r>
     </w:p>
     <w:p>
@@ -5225,7 +5189,7 @@
         <w:spacing w:after="100"/>
       </w:pPr>
       <w:r>
-        <w:t>RNF-02 Mantener una presentación consistente. Las 26 páginas comparten la misma hoja CSS, cabecera, pie y paleta verde y crema.</w:t>
+        <w:t>RNF-02 Mantener una presentación consistente. Las pantallas React deben compartir encabezado, pie, colores y criterios de estilo, incluso al cambiar entre catálogo, cuenta y administración.</w:t>
       </w:r>
     </w:p>
     <w:p>
@@ -5234,7 +5198,7 @@
         <w:spacing w:after="100"/>
       </w:pPr>
       <w:r>
-        <w:t>RNF-08 Facilitar la actualización del catálogo. La información de cada producto debe estar organizada para poder corregirse o ampliarse.</w:t>
+        <w:t>RNF-08 Facilitar la actualización del catálogo. Los datos de cada producto deben estar organizados para que el administrador pueda añadir información e imágenes sin modificar las fichas una por una.</w:t>
       </w:r>
     </w:p>
     <w:p>
@@ -5243,7 +5207,7 @@
         <w:spacing w:after="100"/>
       </w:pPr>
       <w:r>
-        <w:t>RNF-10 Mantener una identidad de marca reconocible. El nombre Grano, su paleta y el tono de los textos deben repetirse de forma coherente.</w:t>
+        <w:t>RNF-10 Mantener una identidad de marca reconocible. El nombre Grano, la paleta y el tono de los textos deben mantenerse coherentes en las distintas pantallas.</w:t>
       </w:r>
     </w:p>
     <w:p>
@@ -5276,7 +5240,7 @@
         <w:spacing w:after="100"/>
       </w:pPr>
       <w:r>
-        <w:t>RNF-01 Adaptarse a celular y escritorio. A 390 y 1440 píxeles el contenido debe mantenerse dentro del ancho de la página. Las tablas pueden desplazarse dentro de su propio contenedor.</w:t>
+        <w:t>RNF-01 Adaptarse a celular y escritorio. El contenido, las tarjetas y los formularios deben ajustarse al ancho disponible sin quedar cortados.</w:t>
       </w:r>
     </w:p>
     <w:p>
@@ -5285,16 +5249,10 @@
         <w:spacing w:after="100"/>
       </w:pPr>
       <w:r>
-        <w:t xml:space="preserve">RNF-03 Permitir navegación accesible. Los enlaces deben mostrar el foco al usar </w:t>
+        <w:t>RNF-03 Permitir una navegación comprensible con teclado. Los botones deben mostrar el foco, los campos deben tener etiqueta y las imágenes informativas deben contar con texto alternativo.</w:t>
       </w:r>
       <w:proofErr w:type="spellStart"/>
-      <w:r>
-        <w:t>Tab</w:t>
-      </w:r>
       <w:proofErr w:type="spellEnd"/>
-      <w:r>
-        <w:t>. Cada campo tiene etiqueta, cada imagen tiene texto alternativo y existe un enlace para saltar al contenido.</w:t>
-      </w:r>
     </w:p>
     <w:p>
       <w:pPr>
@@ -5302,7 +5260,7 @@
         <w:spacing w:after="100"/>
       </w:pPr>
       <w:r>
-        <w:t>RNF-04 Mantener una estructura ordenada. Cada sección debe tener un título claro y la información debe aparecer en un orden que facilite la lectura.</w:t>
+        <w:t>RNF-04 Mantener una estructura ordenada. Cada pantalla debe tener un título claro y presentar la información en un orden fácil de seguir.</w:t>
       </w:r>
     </w:p>
     <w:p>
@@ -5335,9 +5293,8 @@
         <w:keepLines/>
         <w:spacing w:after="100"/>
       </w:pPr>
-      <w:r/>
-      <w:r>
-        <w:t>La propuesta se entrega con los archivos del sitio, la planilla de requisitos actualizada y esta ERS. La documentación refleja las funciones implementadas en la versión actual.</w:t>
+      <w:r>
+        <w:t>Entregamos el sitio inicial y la aplicación React como etapas del mismo proyecto. Esta ERS se actualiza para describir las funciones que ya podemos probar en el navegador.</w:t>
       </w:r>
     </w:p>
     <w:p>
@@ -5346,7 +5303,7 @@
         <w:spacing w:after="100"/>
       </w:pPr>
       <w:r>
-        <w:t>Para seguir trabajando, el equipo debe revisar la información de productos y confirmar que cada sección conserve el tono y la identidad de Grano.</w:t>
+        <w:t>Antes de avanzar, queremos revisar los textos y datos de cada producto, además de comprobar que el registro, el carrito y las pantallas de administración resulten fáciles de usar.</w:t>
       </w:r>
     </w:p>
     <w:p>
@@ -5355,7 +5312,7 @@
         <w:spacing w:after="100"/>
       </w:pPr>
       <w:r>
-        <w:t>La propuesta queda abierta a ajustes según las observaciones de revisión y las nuevas necesidades que se definan para la tienda.</w:t>
+        <w:t>Cuando pasemos a una tienda con datos compartidos entre usuarios, tendremos que reemplazar el almacenamiento local y definir las reglas de compra, pago y despacho.</w:t>
       </w:r>
     </w:p>
     <w:sectPr>

</xml_diff>